<commit_message>
Update HTYN version 1.0 build 2025.09.22.
</commit_message>
<xml_diff>
--- a/articles/finished/HocThuyetYNiem-en.docx
+++ b/articles/finished/HocThuyetYNiem-en.docx
@@ -3537,8 +3537,6 @@
       <w:r>
         <w:t xml:space="preserve">that </w:t>
       </w:r>
-      <w:bookmarkStart w:id="0" w:name="_GoBack"/>
-      <w:bookmarkEnd w:id="0"/>
       <w:r>
         <w:t xml:space="preserve">it implies justification for existence, argument of existence, reason of existence, purpose of existence of </w:t>
       </w:r>
@@ -8902,7 +8900,13 @@
         <w:t xml:space="preserve">(law Idea) </w:t>
       </w:r>
       <w:r>
-        <w:t xml:space="preserve">is the </w:t>
+        <w:t>is</w:t>
+      </w:r>
+      <w:r>
+        <w:t>/comes from</w:t>
+      </w:r>
+      <w:r>
+        <w:t xml:space="preserve"> the </w:t>
       </w:r>
       <w:r>
         <w:t>Idea</w:t>
@@ -9133,7 +9137,129 @@
         <w:t xml:space="preserve">is possible to understand that Hegel’s doctrine </w:t>
       </w:r>
       <w:r>
-        <w:t xml:space="preserve">turns towards objective spirit or absolute spirit which represents or implies God. Note that </w:t>
+        <w:t xml:space="preserve">turns towards objective spirit or absolute spirit which represents or implies God. </w:t>
+      </w:r>
+      <w:r>
+        <w:t xml:space="preserve">The label “rule of law” is attached to </w:t>
+      </w:r>
+      <w:r>
+        <w:t>an</w:t>
+      </w:r>
+      <w:r>
+        <w:t xml:space="preserve"> </w:t>
+      </w:r>
+      <w:r>
+        <w:t>Idea</w:t>
+      </w:r>
+      <w:r>
+        <w:t xml:space="preserve">, so the </w:t>
+      </w:r>
+      <w:r>
+        <w:t xml:space="preserve">Idea </w:t>
+      </w:r>
+      <w:r>
+        <w:t xml:space="preserve">is called </w:t>
+      </w:r>
+      <w:r>
+        <w:t xml:space="preserve">law Idea (Idea </w:t>
+      </w:r>
+      <w:r>
+        <w:t>of rule of law</w:t>
+      </w:r>
+      <w:r>
+        <w:t>)</w:t>
+      </w:r>
+      <w:r>
+        <w:t xml:space="preserve">, or in other words, the </w:t>
+      </w:r>
+      <w:r>
+        <w:t>Idea</w:t>
+      </w:r>
+      <w:r>
+        <w:t xml:space="preserve"> is </w:t>
+      </w:r>
+      <w:r>
+        <w:t xml:space="preserve">considered as </w:t>
+      </w:r>
+      <w:bookmarkStart w:id="0" w:name="_GoBack"/>
+      <w:bookmarkEnd w:id="0"/>
+      <w:r>
+        <w:t xml:space="preserve">rule of law. This is important because later </w:t>
+      </w:r>
+      <w:r>
+        <w:t>I</w:t>
+      </w:r>
+      <w:r>
+        <w:t xml:space="preserve"> will </w:t>
+      </w:r>
+      <w:r>
+        <w:t>study</w:t>
+      </w:r>
+      <w:r>
+        <w:t xml:space="preserve"> that the state as a</w:t>
+      </w:r>
+      <w:r>
+        <w:t>n</w:t>
+      </w:r>
+      <w:r>
+        <w:t xml:space="preserve"> </w:t>
+      </w:r>
+      <w:r>
+        <w:t>Idea</w:t>
+      </w:r>
+      <w:r>
+        <w:t xml:space="preserve"> is already rule of law from the moment </w:t>
+      </w:r>
+      <w:r>
+        <w:t xml:space="preserve">I </w:t>
+      </w:r>
+      <w:r>
+        <w:t xml:space="preserve">begin to contemplate the spectrum from abstract rule of law to morality to </w:t>
+      </w:r>
+      <w:r>
+        <w:t xml:space="preserve">the </w:t>
+      </w:r>
+      <w:r>
+        <w:t xml:space="preserve">ethics </w:t>
+      </w:r>
+      <w:r>
+        <w:t>which is then concretized</w:t>
+      </w:r>
+      <w:r>
+        <w:t xml:space="preserve"> to civil society and the state </w:t>
+      </w:r>
+      <w:r>
+        <w:t>when</w:t>
+      </w:r>
+      <w:r>
+        <w:t xml:space="preserve"> the state </w:t>
+      </w:r>
+      <w:r>
+        <w:t>is considered as an essential entity</w:t>
+      </w:r>
+      <w:r>
+        <w:t xml:space="preserve">. Suppose and really there is an abstract </w:t>
+      </w:r>
+      <w:r>
+        <w:t>Idea</w:t>
+      </w:r>
+      <w:r>
+        <w:t xml:space="preserve"> of “rule of law”, then there will also be the label “rule of law” attached to this </w:t>
+      </w:r>
+      <w:r>
+        <w:t>Idea</w:t>
+      </w:r>
+      <w:r>
+        <w:t xml:space="preserve"> of “rule of law” and of course this </w:t>
+      </w:r>
+      <w:r>
+        <w:t>Idea</w:t>
+      </w:r>
+      <w:r>
+        <w:t xml:space="preserve"> of “rule of law” is rule of law. </w:t>
+      </w:r>
+      <w:r>
+        <w:t xml:space="preserve">Note that </w:t>
       </w:r>
       <w:r>
         <w:t>I</w:t>
@@ -9415,7 +9541,11 @@
         <w:t xml:space="preserve">development </w:t>
       </w:r>
       <w:r>
-        <w:t xml:space="preserve">levels of freedom”. Of course, when eliminating the difference between content and form by universal moment to let the </w:t>
+        <w:t xml:space="preserve">levels of freedom”. Of course, when eliminating the </w:t>
+      </w:r>
+      <w:r>
+        <w:lastRenderedPageBreak/>
+        <w:t xml:space="preserve">difference between content and form by universal moment to let the </w:t>
       </w:r>
       <w:r>
         <w:t>Idea</w:t>
@@ -9550,7 +9680,6 @@
         <w:t xml:space="preserve">in </w:t>
       </w:r>
       <w:r>
-        <w:lastRenderedPageBreak/>
         <w:t>order</w:t>
       </w:r>
       <w:r>
@@ -10523,7 +10652,11 @@
         <w:t>rived</w:t>
       </w:r>
       <w:r>
-        <w:t xml:space="preserve"> from free will, that is, </w:t>
+        <w:t xml:space="preserve"> </w:t>
+      </w:r>
+      <w:r>
+        <w:lastRenderedPageBreak/>
+        <w:t xml:space="preserve">from free will, that is, </w:t>
       </w:r>
       <w:r>
         <w:t xml:space="preserve">existence </w:t>
@@ -10636,7 +10769,6 @@
         <w:t xml:space="preserve"> circle. </w:t>
       </w:r>
       <w:r>
-        <w:lastRenderedPageBreak/>
         <w:t>I</w:t>
       </w:r>
       <w:r>
@@ -11540,7 +11672,11 @@
         <w:t xml:space="preserve">the for-itself, which </w:t>
       </w:r>
       <w:r>
-        <w:t xml:space="preserve">is based on the assumption of objective spirit/absolute spirit. Similarly, the process of self-development and </w:t>
+        <w:t xml:space="preserve">is based on the </w:t>
+      </w:r>
+      <w:r>
+        <w:lastRenderedPageBreak/>
+        <w:t xml:space="preserve">assumption of objective spirit/absolute spirit. Similarly, the process of self-development and </w:t>
       </w:r>
       <w:r>
         <w:t>self-</w:t>
@@ -11621,11 +11757,7 @@
         <w:t>of free will alway</w:t>
       </w:r>
       <w:r>
-        <w:t xml:space="preserve">s </w:t>
-      </w:r>
-      <w:r>
-        <w:lastRenderedPageBreak/>
-        <w:t xml:space="preserve">ensures rationality (justice), </w:t>
+        <w:t xml:space="preserve">s ensures rationality (justice), </w:t>
       </w:r>
       <w:r>
         <w:t>being moderately possible that</w:t>
@@ -13092,7 +13224,7 @@
 </file>
 
 <file path=customXml/itemProps1.xml><?xml version="1.0" encoding="utf-8"?>
-<ds:datastoreItem xmlns:ds="http://schemas.openxmlformats.org/officeDocument/2006/customXml" ds:itemID="{C1836859-8B52-4571-924F-DD49151C5FB6}">
+<ds:datastoreItem xmlns:ds="http://schemas.openxmlformats.org/officeDocument/2006/customXml" ds:itemID="{699C1F24-CC66-450A-98CF-9166DE2C844E}">
   <ds:schemaRefs>
     <ds:schemaRef ds:uri="http://schemas.openxmlformats.org/officeDocument/2006/bibliography"/>
   </ds:schemaRefs>

</xml_diff>